<commit_message>
Organizar repositorio: carpeta de codigo limpia y actualizacion editorial de tesis
</commit_message>
<xml_diff>
--- a/Trabajo Integracion Curricular Carlos Cacuango Cap I.DOCX
+++ b/Trabajo Integracion Curricular Carlos Cacuango Cap I.DOCX
@@ -15351,8 +15351,17 @@
       </w:pPr>
     </w:p>
     <w:p/>
+    <w:p>
+      <w:r>
+        <w:t>DISEÑO, SIMULACIÓN Y PROTOTIPADO DE COMUNICACIONES VEHICULARES BASADAS EN LUZ VISIBLE</w:t>
+      </w:r>
+    </w:p>
     <w:p/>
-    <w:p/>
+    <w:p>
+      <w:r>
+        <w:t>SIMULACIÓN DE UN SISTEMA VLC VEHICULAR</w:t>
+      </w:r>
+    </w:p>
     <w:p/>
     <w:p/>
     <w:p/>
@@ -19211,6 +19220,1981 @@
         <w:t xml:space="preserve"> hojas, sin considerar los anexos.</w:t>
       </w:r>
     </w:p>
+    <w:p>
+      <w:pPr>
+        <w:pStyle w:val="Texto"/>
+      </w:pPr>
+    </w:p>
+    <w:p>
+      <w:pPr>
+        <w:pStyle w:val="Texto"/>
+      </w:pPr>
+    </w:p>
+    <w:p>
+      <w:pPr>
+        <w:pStyle w:val="Texto"/>
+        <w:numPr>
+          <w:ilvl w:val="0"/>
+          <w:numId w:val="19"/>
+        </w:numPr>
+      </w:pPr>
+      <w:r>
+        <w:t>Lista de Siglas en Orden de Aparición</w:t>
+      </w:r>
+    </w:p>
+    <w:p>
+      <w:pPr>
+        <w:pStyle w:val="Texto"/>
+        <w:numPr>
+          <w:ilvl w:val="0"/>
+          <w:numId w:val="19"/>
+        </w:numPr>
+        <w:rPr>
+          <w:lang w:val="en-US"/>
+        </w:rPr>
+      </w:pPr>
+      <w:r>
+        <w:rPr>
+          <w:b/>
+          <w:bCs/>
+          <w:lang w:val="en-US"/>
+        </w:rPr>
+        <w:t>VLC</w:t>
+      </w:r>
+      <w:r>
+        <w:rPr>
+          <w:lang w:val="en-US"/>
+        </w:rPr>
+        <w:t> (\</w:t>
+      </w:r>
+      <w:proofErr w:type="spellStart"/>
+      <w:r>
+        <w:rPr>
+          <w:lang w:val="en-US"/>
+        </w:rPr>
+        <w:t>textit</w:t>
+      </w:r>
+      <w:proofErr w:type="spellEnd"/>
+      <w:r>
+        <w:rPr>
+          <w:lang w:val="en-US"/>
+        </w:rPr>
+        <w:t xml:space="preserve">{Visible Light Communication}) — </w:t>
+      </w:r>
+      <w:proofErr w:type="spellStart"/>
+      <w:r>
+        <w:rPr>
+          <w:lang w:val="en-US"/>
+        </w:rPr>
+        <w:t>Resumen</w:t>
+      </w:r>
+      <w:proofErr w:type="spellEnd"/>
+      <w:r>
+        <w:rPr>
+          <w:lang w:val="en-US"/>
+        </w:rPr>
+        <w:t xml:space="preserve"> y Abstract (</w:t>
+      </w:r>
+      <w:proofErr w:type="spellStart"/>
+      <w:r>
+        <w:rPr>
+          <w:lang w:val="en-US"/>
+        </w:rPr>
+        <w:t>Preliminares</w:t>
+      </w:r>
+      <w:proofErr w:type="spellEnd"/>
+      <w:r>
+        <w:rPr>
+          <w:lang w:val="en-US"/>
+        </w:rPr>
+        <w:t>)</w:t>
+      </w:r>
+    </w:p>
+    <w:p>
+      <w:pPr>
+        <w:pStyle w:val="Texto"/>
+        <w:numPr>
+          <w:ilvl w:val="0"/>
+          <w:numId w:val="19"/>
+        </w:numPr>
+        <w:rPr>
+          <w:lang w:val="en-US"/>
+        </w:rPr>
+      </w:pPr>
+      <w:r>
+        <w:rPr>
+          <w:b/>
+          <w:bCs/>
+          <w:lang w:val="en-US"/>
+        </w:rPr>
+        <w:t>IEEE</w:t>
+      </w:r>
+      <w:r>
+        <w:rPr>
+          <w:lang w:val="en-US"/>
+        </w:rPr>
+        <w:t> (\</w:t>
+      </w:r>
+      <w:proofErr w:type="spellStart"/>
+      <w:r>
+        <w:rPr>
+          <w:lang w:val="en-US"/>
+        </w:rPr>
+        <w:t>textit</w:t>
+      </w:r>
+      <w:proofErr w:type="spellEnd"/>
+      <w:r>
+        <w:rPr>
+          <w:lang w:val="en-US"/>
+        </w:rPr>
+        <w:t xml:space="preserve">{Institute of Electrical and Electronics Engineers}) — </w:t>
+      </w:r>
+      <w:proofErr w:type="spellStart"/>
+      <w:r>
+        <w:rPr>
+          <w:lang w:val="en-US"/>
+        </w:rPr>
+        <w:t>Resumen</w:t>
+      </w:r>
+      <w:proofErr w:type="spellEnd"/>
+      <w:r>
+        <w:rPr>
+          <w:lang w:val="en-US"/>
+        </w:rPr>
+        <w:t xml:space="preserve"> y Abstract (</w:t>
+      </w:r>
+      <w:proofErr w:type="spellStart"/>
+      <w:r>
+        <w:rPr>
+          <w:lang w:val="en-US"/>
+        </w:rPr>
+        <w:t>Preliminares</w:t>
+      </w:r>
+      <w:proofErr w:type="spellEnd"/>
+      <w:r>
+        <w:rPr>
+          <w:lang w:val="en-US"/>
+        </w:rPr>
+        <w:t>)</w:t>
+      </w:r>
+    </w:p>
+    <w:p>
+      <w:pPr>
+        <w:pStyle w:val="Texto"/>
+        <w:numPr>
+          <w:ilvl w:val="0"/>
+          <w:numId w:val="19"/>
+        </w:numPr>
+      </w:pPr>
+      <w:r>
+        <w:rPr>
+          <w:b/>
+          <w:bCs/>
+        </w:rPr>
+        <w:t>V2I</w:t>
+      </w:r>
+      <w:r>
+        <w:t> (\</w:t>
+      </w:r>
+      <w:proofErr w:type="spellStart"/>
+      <w:r>
+        <w:t>textit</w:t>
+      </w:r>
+      <w:proofErr w:type="spellEnd"/>
+      <w:r>
+        <w:t>{</w:t>
+      </w:r>
+      <w:proofErr w:type="spellStart"/>
+      <w:r>
+        <w:t>Vehicle-to-Infrastructure</w:t>
+      </w:r>
+      <w:proofErr w:type="spellEnd"/>
+      <w:r>
+        <w:t xml:space="preserve">}) — Resumen y </w:t>
+      </w:r>
+      <w:proofErr w:type="spellStart"/>
+      <w:r>
+        <w:t>Abstract</w:t>
+      </w:r>
+      <w:proofErr w:type="spellEnd"/>
+      <w:r>
+        <w:t xml:space="preserve"> (Preliminares)</w:t>
+      </w:r>
+    </w:p>
+    <w:p>
+      <w:pPr>
+        <w:pStyle w:val="Texto"/>
+        <w:numPr>
+          <w:ilvl w:val="0"/>
+          <w:numId w:val="19"/>
+        </w:numPr>
+        <w:rPr>
+          <w:lang w:val="en-US"/>
+        </w:rPr>
+      </w:pPr>
+      <w:r>
+        <w:rPr>
+          <w:b/>
+          <w:bCs/>
+          <w:lang w:val="en-US"/>
+        </w:rPr>
+        <w:t>DCO-OFDM</w:t>
+      </w:r>
+      <w:r>
+        <w:rPr>
+          <w:lang w:val="en-US"/>
+        </w:rPr>
+        <w:t> (\</w:t>
+      </w:r>
+      <w:proofErr w:type="spellStart"/>
+      <w:r>
+        <w:rPr>
+          <w:lang w:val="en-US"/>
+        </w:rPr>
+        <w:t>textit</w:t>
+      </w:r>
+      <w:proofErr w:type="spellEnd"/>
+      <w:r>
+        <w:rPr>
+          <w:lang w:val="en-US"/>
+        </w:rPr>
+        <w:t xml:space="preserve">{Direct Current Biased Optical Orthogonal Frequency Division Multiplexing}) — </w:t>
+      </w:r>
+      <w:proofErr w:type="spellStart"/>
+      <w:r>
+        <w:rPr>
+          <w:lang w:val="en-US"/>
+        </w:rPr>
+        <w:t>Resumen</w:t>
+      </w:r>
+      <w:proofErr w:type="spellEnd"/>
+      <w:r>
+        <w:rPr>
+          <w:lang w:val="en-US"/>
+        </w:rPr>
+        <w:t xml:space="preserve"> y Abstract (</w:t>
+      </w:r>
+      <w:proofErr w:type="spellStart"/>
+      <w:r>
+        <w:rPr>
+          <w:lang w:val="en-US"/>
+        </w:rPr>
+        <w:t>Preliminares</w:t>
+      </w:r>
+      <w:proofErr w:type="spellEnd"/>
+      <w:r>
+        <w:rPr>
+          <w:lang w:val="en-US"/>
+        </w:rPr>
+        <w:t>)</w:t>
+      </w:r>
+    </w:p>
+    <w:p>
+      <w:pPr>
+        <w:pStyle w:val="Texto"/>
+        <w:numPr>
+          <w:ilvl w:val="0"/>
+          <w:numId w:val="19"/>
+        </w:numPr>
+      </w:pPr>
+      <w:r>
+        <w:rPr>
+          <w:b/>
+          <w:bCs/>
+        </w:rPr>
+        <w:t>FEC</w:t>
+      </w:r>
+      <w:r>
+        <w:t> (\</w:t>
+      </w:r>
+      <w:proofErr w:type="spellStart"/>
+      <w:r>
+        <w:t>textit</w:t>
+      </w:r>
+      <w:proofErr w:type="spellEnd"/>
+      <w:r>
+        <w:t xml:space="preserve">{Forward Error </w:t>
+      </w:r>
+      <w:proofErr w:type="spellStart"/>
+      <w:r>
+        <w:t>Correction</w:t>
+      </w:r>
+      <w:proofErr w:type="spellEnd"/>
+      <w:r>
+        <w:t xml:space="preserve">}) — Resumen y </w:t>
+      </w:r>
+      <w:proofErr w:type="spellStart"/>
+      <w:r>
+        <w:t>Abstract</w:t>
+      </w:r>
+      <w:proofErr w:type="spellEnd"/>
+      <w:r>
+        <w:t xml:space="preserve"> (Preliminares)</w:t>
+      </w:r>
+    </w:p>
+    <w:p>
+      <w:pPr>
+        <w:pStyle w:val="Texto"/>
+        <w:numPr>
+          <w:ilvl w:val="0"/>
+          <w:numId w:val="19"/>
+        </w:numPr>
+        <w:rPr>
+          <w:lang w:val="en-US"/>
+        </w:rPr>
+      </w:pPr>
+      <w:r>
+        <w:rPr>
+          <w:b/>
+          <w:bCs/>
+          <w:lang w:val="en-US"/>
+        </w:rPr>
+        <w:t>BPSK</w:t>
+      </w:r>
+      <w:r>
+        <w:rPr>
+          <w:lang w:val="en-US"/>
+        </w:rPr>
+        <w:t> (\</w:t>
+      </w:r>
+      <w:proofErr w:type="spellStart"/>
+      <w:r>
+        <w:rPr>
+          <w:lang w:val="en-US"/>
+        </w:rPr>
+        <w:t>textit</w:t>
+      </w:r>
+      <w:proofErr w:type="spellEnd"/>
+      <w:r>
+        <w:rPr>
+          <w:lang w:val="en-US"/>
+        </w:rPr>
+        <w:t xml:space="preserve">{Binary Phase Shift Keying}) — </w:t>
+      </w:r>
+      <w:proofErr w:type="spellStart"/>
+      <w:r>
+        <w:rPr>
+          <w:lang w:val="en-US"/>
+        </w:rPr>
+        <w:t>Resumen</w:t>
+      </w:r>
+      <w:proofErr w:type="spellEnd"/>
+      <w:r>
+        <w:rPr>
+          <w:lang w:val="en-US"/>
+        </w:rPr>
+        <w:t xml:space="preserve"> y Abstract (</w:t>
+      </w:r>
+      <w:proofErr w:type="spellStart"/>
+      <w:r>
+        <w:rPr>
+          <w:lang w:val="en-US"/>
+        </w:rPr>
+        <w:t>Preliminares</w:t>
+      </w:r>
+      <w:proofErr w:type="spellEnd"/>
+      <w:r>
+        <w:rPr>
+          <w:lang w:val="en-US"/>
+        </w:rPr>
+        <w:t>)</w:t>
+      </w:r>
+    </w:p>
+    <w:p>
+      <w:pPr>
+        <w:pStyle w:val="Texto"/>
+        <w:numPr>
+          <w:ilvl w:val="0"/>
+          <w:numId w:val="19"/>
+        </w:numPr>
+      </w:pPr>
+      <w:r>
+        <w:rPr>
+          <w:b/>
+          <w:bCs/>
+        </w:rPr>
+        <w:t>QAM</w:t>
+      </w:r>
+      <w:r>
+        <w:t> (\</w:t>
+      </w:r>
+      <w:proofErr w:type="spellStart"/>
+      <w:r>
+        <w:t>textit</w:t>
+      </w:r>
+      <w:proofErr w:type="spellEnd"/>
+      <w:r>
+        <w:t>{</w:t>
+      </w:r>
+      <w:proofErr w:type="spellStart"/>
+      <w:r>
+        <w:t>Quadrature</w:t>
+      </w:r>
+      <w:proofErr w:type="spellEnd"/>
+      <w:r>
+        <w:t xml:space="preserve"> </w:t>
+      </w:r>
+      <w:proofErr w:type="spellStart"/>
+      <w:r>
+        <w:t>Amplitude</w:t>
+      </w:r>
+      <w:proofErr w:type="spellEnd"/>
+      <w:r>
+        <w:t xml:space="preserve"> </w:t>
+      </w:r>
+      <w:proofErr w:type="spellStart"/>
+      <w:r>
+        <w:t>Modulation</w:t>
+      </w:r>
+      <w:proofErr w:type="spellEnd"/>
+      <w:r>
+        <w:t xml:space="preserve">}) — Resumen y </w:t>
+      </w:r>
+      <w:proofErr w:type="spellStart"/>
+      <w:r>
+        <w:t>Abstract</w:t>
+      </w:r>
+      <w:proofErr w:type="spellEnd"/>
+      <w:r>
+        <w:t xml:space="preserve"> (Preliminares)</w:t>
+      </w:r>
+    </w:p>
+    <w:p>
+      <w:pPr>
+        <w:pStyle w:val="Texto"/>
+        <w:numPr>
+          <w:ilvl w:val="0"/>
+          <w:numId w:val="19"/>
+        </w:numPr>
+        <w:rPr>
+          <w:lang w:val="en-US"/>
+        </w:rPr>
+      </w:pPr>
+      <w:r>
+        <w:rPr>
+          <w:b/>
+          <w:bCs/>
+          <w:lang w:val="en-US"/>
+        </w:rPr>
+        <w:t>IFFT</w:t>
+      </w:r>
+      <w:r>
+        <w:rPr>
+          <w:lang w:val="en-US"/>
+        </w:rPr>
+        <w:t> (\</w:t>
+      </w:r>
+      <w:proofErr w:type="spellStart"/>
+      <w:r>
+        <w:rPr>
+          <w:lang w:val="en-US"/>
+        </w:rPr>
+        <w:t>textit</w:t>
+      </w:r>
+      <w:proofErr w:type="spellEnd"/>
+      <w:r>
+        <w:rPr>
+          <w:lang w:val="en-US"/>
+        </w:rPr>
+        <w:t xml:space="preserve">{Inverse Fast Fourier Transform}) — </w:t>
+      </w:r>
+      <w:proofErr w:type="spellStart"/>
+      <w:r>
+        <w:rPr>
+          <w:lang w:val="en-US"/>
+        </w:rPr>
+        <w:t>Resumen</w:t>
+      </w:r>
+      <w:proofErr w:type="spellEnd"/>
+      <w:r>
+        <w:rPr>
+          <w:lang w:val="en-US"/>
+        </w:rPr>
+        <w:t xml:space="preserve"> y Abstract (</w:t>
+      </w:r>
+      <w:proofErr w:type="spellStart"/>
+      <w:r>
+        <w:rPr>
+          <w:lang w:val="en-US"/>
+        </w:rPr>
+        <w:t>Preliminares</w:t>
+      </w:r>
+      <w:proofErr w:type="spellEnd"/>
+      <w:r>
+        <w:rPr>
+          <w:lang w:val="en-US"/>
+        </w:rPr>
+        <w:t>)</w:t>
+      </w:r>
+    </w:p>
+    <w:p>
+      <w:pPr>
+        <w:pStyle w:val="Texto"/>
+        <w:numPr>
+          <w:ilvl w:val="0"/>
+          <w:numId w:val="19"/>
+        </w:numPr>
+      </w:pPr>
+      <w:r>
+        <w:rPr>
+          <w:b/>
+          <w:bCs/>
+        </w:rPr>
+        <w:t>DC</w:t>
+      </w:r>
+      <w:r>
+        <w:t> (\</w:t>
+      </w:r>
+      <w:proofErr w:type="spellStart"/>
+      <w:r>
+        <w:t>textit</w:t>
+      </w:r>
+      <w:proofErr w:type="spellEnd"/>
+      <w:r>
+        <w:t xml:space="preserve">{Direct Current}) — Resumen y </w:t>
+      </w:r>
+      <w:proofErr w:type="spellStart"/>
+      <w:r>
+        <w:t>Abstract</w:t>
+      </w:r>
+      <w:proofErr w:type="spellEnd"/>
+      <w:r>
+        <w:t xml:space="preserve"> (Preliminares)</w:t>
+      </w:r>
+    </w:p>
+    <w:p>
+      <w:pPr>
+        <w:pStyle w:val="Texto"/>
+        <w:numPr>
+          <w:ilvl w:val="0"/>
+          <w:numId w:val="19"/>
+        </w:numPr>
+        <w:rPr>
+          <w:lang w:val="en-US"/>
+        </w:rPr>
+      </w:pPr>
+      <w:r>
+        <w:rPr>
+          <w:b/>
+          <w:bCs/>
+          <w:lang w:val="en-US"/>
+        </w:rPr>
+        <w:t>LED</w:t>
+      </w:r>
+      <w:r>
+        <w:rPr>
+          <w:lang w:val="en-US"/>
+        </w:rPr>
+        <w:t> (\</w:t>
+      </w:r>
+      <w:proofErr w:type="spellStart"/>
+      <w:r>
+        <w:rPr>
+          <w:lang w:val="en-US"/>
+        </w:rPr>
+        <w:t>textit</w:t>
+      </w:r>
+      <w:proofErr w:type="spellEnd"/>
+      <w:r>
+        <w:rPr>
+          <w:lang w:val="en-US"/>
+        </w:rPr>
+        <w:t xml:space="preserve">{Light Emitting Diode}) — </w:t>
+      </w:r>
+      <w:proofErr w:type="spellStart"/>
+      <w:r>
+        <w:rPr>
+          <w:lang w:val="en-US"/>
+        </w:rPr>
+        <w:t>Resumen</w:t>
+      </w:r>
+      <w:proofErr w:type="spellEnd"/>
+      <w:r>
+        <w:rPr>
+          <w:lang w:val="en-US"/>
+        </w:rPr>
+        <w:t xml:space="preserve"> y Abstract (</w:t>
+      </w:r>
+      <w:proofErr w:type="spellStart"/>
+      <w:r>
+        <w:rPr>
+          <w:lang w:val="en-US"/>
+        </w:rPr>
+        <w:t>Preliminares</w:t>
+      </w:r>
+      <w:proofErr w:type="spellEnd"/>
+      <w:r>
+        <w:rPr>
+          <w:lang w:val="en-US"/>
+        </w:rPr>
+        <w:t>)</w:t>
+      </w:r>
+    </w:p>
+    <w:p>
+      <w:pPr>
+        <w:pStyle w:val="Texto"/>
+        <w:numPr>
+          <w:ilvl w:val="0"/>
+          <w:numId w:val="19"/>
+        </w:numPr>
+      </w:pPr>
+      <w:r>
+        <w:rPr>
+          <w:b/>
+          <w:bCs/>
+        </w:rPr>
+        <w:t>LOS</w:t>
+      </w:r>
+      <w:r>
+        <w:t> (\</w:t>
+      </w:r>
+      <w:proofErr w:type="spellStart"/>
+      <w:r>
+        <w:t>textit</w:t>
+      </w:r>
+      <w:proofErr w:type="spellEnd"/>
+      <w:r>
+        <w:t>{Line-</w:t>
+      </w:r>
+      <w:proofErr w:type="spellStart"/>
+      <w:r>
+        <w:t>of</w:t>
+      </w:r>
+      <w:proofErr w:type="spellEnd"/>
+      <w:r>
+        <w:t>-</w:t>
+      </w:r>
+      <w:proofErr w:type="spellStart"/>
+      <w:r>
+        <w:t>Sight</w:t>
+      </w:r>
+      <w:proofErr w:type="spellEnd"/>
+      <w:r>
+        <w:t xml:space="preserve">}) — Resumen y </w:t>
+      </w:r>
+      <w:proofErr w:type="spellStart"/>
+      <w:r>
+        <w:t>Abstract</w:t>
+      </w:r>
+      <w:proofErr w:type="spellEnd"/>
+      <w:r>
+        <w:t xml:space="preserve"> (Preliminares)</w:t>
+      </w:r>
+    </w:p>
+    <w:p>
+      <w:pPr>
+        <w:pStyle w:val="Texto"/>
+        <w:numPr>
+          <w:ilvl w:val="0"/>
+          <w:numId w:val="19"/>
+        </w:numPr>
+      </w:pPr>
+      <w:r>
+        <w:rPr>
+          <w:b/>
+          <w:bCs/>
+        </w:rPr>
+        <w:t>BER</w:t>
+      </w:r>
+      <w:r>
+        <w:t> (\</w:t>
+      </w:r>
+      <w:proofErr w:type="spellStart"/>
+      <w:r>
+        <w:t>textit</w:t>
+      </w:r>
+      <w:proofErr w:type="spellEnd"/>
+      <w:r>
+        <w:t xml:space="preserve">{Bit Error Rate}) — Resumen y </w:t>
+      </w:r>
+      <w:proofErr w:type="spellStart"/>
+      <w:r>
+        <w:t>Abstract</w:t>
+      </w:r>
+      <w:proofErr w:type="spellEnd"/>
+      <w:r>
+        <w:t xml:space="preserve"> (Preliminares)</w:t>
+      </w:r>
+    </w:p>
+    <w:p>
+      <w:pPr>
+        <w:pStyle w:val="Texto"/>
+        <w:numPr>
+          <w:ilvl w:val="0"/>
+          <w:numId w:val="19"/>
+        </w:numPr>
+        <w:rPr>
+          <w:lang w:val="en-US"/>
+        </w:rPr>
+      </w:pPr>
+      <w:r>
+        <w:rPr>
+          <w:b/>
+          <w:bCs/>
+          <w:lang w:val="en-US"/>
+        </w:rPr>
+        <w:t>MCS</w:t>
+      </w:r>
+      <w:r>
+        <w:rPr>
+          <w:lang w:val="en-US"/>
+        </w:rPr>
+        <w:t> (\</w:t>
+      </w:r>
+      <w:proofErr w:type="spellStart"/>
+      <w:r>
+        <w:rPr>
+          <w:lang w:val="en-US"/>
+        </w:rPr>
+        <w:t>textit</w:t>
+      </w:r>
+      <w:proofErr w:type="spellEnd"/>
+      <w:r>
+        <w:rPr>
+          <w:lang w:val="en-US"/>
+        </w:rPr>
+        <w:t xml:space="preserve">{Modulation and Coding Scheme}) — </w:t>
+      </w:r>
+      <w:proofErr w:type="spellStart"/>
+      <w:r>
+        <w:rPr>
+          <w:lang w:val="en-US"/>
+        </w:rPr>
+        <w:t>Resumen</w:t>
+      </w:r>
+      <w:proofErr w:type="spellEnd"/>
+      <w:r>
+        <w:rPr>
+          <w:lang w:val="en-US"/>
+        </w:rPr>
+        <w:t xml:space="preserve"> y Abstract (</w:t>
+      </w:r>
+      <w:proofErr w:type="spellStart"/>
+      <w:r>
+        <w:rPr>
+          <w:lang w:val="en-US"/>
+        </w:rPr>
+        <w:t>Preliminares</w:t>
+      </w:r>
+      <w:proofErr w:type="spellEnd"/>
+      <w:r>
+        <w:rPr>
+          <w:lang w:val="en-US"/>
+        </w:rPr>
+        <w:t>)</w:t>
+      </w:r>
+    </w:p>
+    <w:p>
+      <w:pPr>
+        <w:pStyle w:val="Texto"/>
+        <w:numPr>
+          <w:ilvl w:val="0"/>
+          <w:numId w:val="19"/>
+        </w:numPr>
+      </w:pPr>
+      <w:proofErr w:type="spellStart"/>
+      <w:r>
+        <w:rPr>
+          <w:b/>
+          <w:bCs/>
+        </w:rPr>
+        <w:t>LiFi</w:t>
+      </w:r>
+      <w:proofErr w:type="spellEnd"/>
+      <w:r>
+        <w:t> (\</w:t>
+      </w:r>
+      <w:proofErr w:type="spellStart"/>
+      <w:r>
+        <w:t>textit</w:t>
+      </w:r>
+      <w:proofErr w:type="spellEnd"/>
+      <w:r>
+        <w:t xml:space="preserve">{Light Fidelity}) — Resumen y </w:t>
+      </w:r>
+      <w:proofErr w:type="spellStart"/>
+      <w:r>
+        <w:t>Abstract</w:t>
+      </w:r>
+      <w:proofErr w:type="spellEnd"/>
+      <w:r>
+        <w:t xml:space="preserve"> (Preliminares)</w:t>
+      </w:r>
+    </w:p>
+    <w:p>
+      <w:pPr>
+        <w:pStyle w:val="Texto"/>
+        <w:numPr>
+          <w:ilvl w:val="0"/>
+          <w:numId w:val="19"/>
+        </w:numPr>
+      </w:pPr>
+      <w:r>
+        <w:rPr>
+          <w:b/>
+          <w:bCs/>
+        </w:rPr>
+        <w:t>SNR</w:t>
+      </w:r>
+      <w:r>
+        <w:t> (\</w:t>
+      </w:r>
+      <w:proofErr w:type="spellStart"/>
+      <w:r>
+        <w:t>textit</w:t>
+      </w:r>
+      <w:proofErr w:type="spellEnd"/>
+      <w:r>
+        <w:t>{Signal-to-Noise Ratio}) — Capítulo 1 (Sección Objetivo General)</w:t>
+      </w:r>
+    </w:p>
+    <w:p>
+      <w:pPr>
+        <w:pStyle w:val="Texto"/>
+        <w:numPr>
+          <w:ilvl w:val="0"/>
+          <w:numId w:val="19"/>
+        </w:numPr>
+      </w:pPr>
+      <w:r>
+        <w:rPr>
+          <w:b/>
+          <w:bCs/>
+        </w:rPr>
+        <w:t>AWGN</w:t>
+      </w:r>
+      <w:r>
+        <w:t> (\</w:t>
+      </w:r>
+      <w:proofErr w:type="spellStart"/>
+      <w:r>
+        <w:t>textit</w:t>
+      </w:r>
+      <w:proofErr w:type="spellEnd"/>
+      <w:r>
+        <w:t>{</w:t>
+      </w:r>
+      <w:proofErr w:type="spellStart"/>
+      <w:r>
+        <w:t>Additive</w:t>
+      </w:r>
+      <w:proofErr w:type="spellEnd"/>
+      <w:r>
+        <w:t xml:space="preserve"> White Gaussian Noise}) — Capítulo 1 (Sección Objetivos Específicos)</w:t>
+      </w:r>
+    </w:p>
+    <w:p>
+      <w:pPr>
+        <w:pStyle w:val="Texto"/>
+        <w:numPr>
+          <w:ilvl w:val="0"/>
+          <w:numId w:val="19"/>
+        </w:numPr>
+      </w:pPr>
+      <w:r>
+        <w:rPr>
+          <w:b/>
+          <w:bCs/>
+        </w:rPr>
+        <w:t>OFDM</w:t>
+      </w:r>
+      <w:r>
+        <w:t> (\</w:t>
+      </w:r>
+      <w:proofErr w:type="spellStart"/>
+      <w:r>
+        <w:t>textit</w:t>
+      </w:r>
+      <w:proofErr w:type="spellEnd"/>
+      <w:r>
+        <w:t>{</w:t>
+      </w:r>
+      <w:proofErr w:type="spellStart"/>
+      <w:r>
+        <w:t>Orthogonal</w:t>
+      </w:r>
+      <w:proofErr w:type="spellEnd"/>
+      <w:r>
+        <w:t xml:space="preserve"> </w:t>
+      </w:r>
+      <w:proofErr w:type="spellStart"/>
+      <w:r>
+        <w:t>Frequency</w:t>
+      </w:r>
+      <w:proofErr w:type="spellEnd"/>
+      <w:r>
+        <w:t xml:space="preserve"> </w:t>
+      </w:r>
+      <w:proofErr w:type="spellStart"/>
+      <w:r>
+        <w:t>Division</w:t>
+      </w:r>
+      <w:proofErr w:type="spellEnd"/>
+      <w:r>
+        <w:t xml:space="preserve"> </w:t>
+      </w:r>
+      <w:proofErr w:type="spellStart"/>
+      <w:r>
+        <w:t>Multiplexing</w:t>
+      </w:r>
+      <w:proofErr w:type="spellEnd"/>
+      <w:r>
+        <w:t>}) — Capítulo 1 (Sección Alcance)</w:t>
+      </w:r>
+    </w:p>
+    <w:p>
+      <w:pPr>
+        <w:pStyle w:val="Texto"/>
+        <w:numPr>
+          <w:ilvl w:val="0"/>
+          <w:numId w:val="19"/>
+        </w:numPr>
+      </w:pPr>
+      <w:r>
+        <w:rPr>
+          <w:b/>
+          <w:bCs/>
+        </w:rPr>
+        <w:t>FFT</w:t>
+      </w:r>
+      <w:r>
+        <w:t> (\</w:t>
+      </w:r>
+      <w:proofErr w:type="spellStart"/>
+      <w:r>
+        <w:t>textit</w:t>
+      </w:r>
+      <w:proofErr w:type="spellEnd"/>
+      <w:r>
+        <w:t xml:space="preserve">{Fast Fourier </w:t>
+      </w:r>
+      <w:proofErr w:type="spellStart"/>
+      <w:r>
+        <w:t>Transform</w:t>
+      </w:r>
+      <w:proofErr w:type="spellEnd"/>
+      <w:r>
+        <w:t>}) — Capítulo 1 (Sección Alcance)</w:t>
+      </w:r>
+    </w:p>
+    <w:p>
+      <w:pPr>
+        <w:pStyle w:val="Texto"/>
+        <w:numPr>
+          <w:ilvl w:val="0"/>
+          <w:numId w:val="19"/>
+        </w:numPr>
+      </w:pPr>
+      <w:r>
+        <w:rPr>
+          <w:b/>
+          <w:bCs/>
+        </w:rPr>
+        <w:lastRenderedPageBreak/>
+        <w:t>ITS</w:t>
+      </w:r>
+      <w:r>
+        <w:t> (\</w:t>
+      </w:r>
+      <w:proofErr w:type="spellStart"/>
+      <w:r>
+        <w:t>textit</w:t>
+      </w:r>
+      <w:proofErr w:type="spellEnd"/>
+      <w:r>
+        <w:t>{</w:t>
+      </w:r>
+      <w:proofErr w:type="spellStart"/>
+      <w:r>
+        <w:t>Intelligent</w:t>
+      </w:r>
+      <w:proofErr w:type="spellEnd"/>
+      <w:r>
+        <w:t xml:space="preserve"> </w:t>
+      </w:r>
+      <w:proofErr w:type="spellStart"/>
+      <w:r>
+        <w:t>Transportation</w:t>
+      </w:r>
+      <w:proofErr w:type="spellEnd"/>
+      <w:r>
+        <w:t xml:space="preserve"> </w:t>
+      </w:r>
+      <w:proofErr w:type="spellStart"/>
+      <w:r>
+        <w:t>Systems</w:t>
+      </w:r>
+      <w:proofErr w:type="spellEnd"/>
+      <w:r>
+        <w:t>}) — Capítulo 1 (Sección Marco Teórico)</w:t>
+      </w:r>
+    </w:p>
+    <w:p>
+      <w:pPr>
+        <w:pStyle w:val="Texto"/>
+        <w:numPr>
+          <w:ilvl w:val="0"/>
+          <w:numId w:val="19"/>
+        </w:numPr>
+      </w:pPr>
+      <w:r>
+        <w:rPr>
+          <w:b/>
+          <w:bCs/>
+        </w:rPr>
+        <w:t>V2X</w:t>
+      </w:r>
+      <w:r>
+        <w:t> (\</w:t>
+      </w:r>
+      <w:proofErr w:type="spellStart"/>
+      <w:r>
+        <w:t>textit</w:t>
+      </w:r>
+      <w:proofErr w:type="spellEnd"/>
+      <w:r>
+        <w:t>{</w:t>
+      </w:r>
+      <w:proofErr w:type="spellStart"/>
+      <w:r>
+        <w:t>Vehicle-to-Everything</w:t>
+      </w:r>
+      <w:proofErr w:type="spellEnd"/>
+      <w:r>
+        <w:t>}) — Capítulo 1 (Sección Marco Teórico)</w:t>
+      </w:r>
+    </w:p>
+    <w:p>
+      <w:pPr>
+        <w:pStyle w:val="Texto"/>
+        <w:numPr>
+          <w:ilvl w:val="0"/>
+          <w:numId w:val="19"/>
+        </w:numPr>
+      </w:pPr>
+      <w:r>
+        <w:rPr>
+          <w:b/>
+          <w:bCs/>
+        </w:rPr>
+        <w:t>RF</w:t>
+      </w:r>
+      <w:r>
+        <w:t> (\</w:t>
+      </w:r>
+      <w:proofErr w:type="spellStart"/>
+      <w:r>
+        <w:t>textit</w:t>
+      </w:r>
+      <w:proofErr w:type="spellEnd"/>
+      <w:r>
+        <w:t xml:space="preserve">{Radio </w:t>
+      </w:r>
+      <w:proofErr w:type="spellStart"/>
+      <w:r>
+        <w:t>Frequency</w:t>
+      </w:r>
+      <w:proofErr w:type="spellEnd"/>
+      <w:r>
+        <w:t>}) — Capítulo 1 (Sección Marco Teórico)</w:t>
+      </w:r>
+    </w:p>
+    <w:p>
+      <w:pPr>
+        <w:pStyle w:val="Texto"/>
+        <w:numPr>
+          <w:ilvl w:val="0"/>
+          <w:numId w:val="19"/>
+        </w:numPr>
+      </w:pPr>
+      <w:r>
+        <w:rPr>
+          <w:b/>
+          <w:bCs/>
+        </w:rPr>
+        <w:t>DSRC</w:t>
+      </w:r>
+      <w:r>
+        <w:t> (\</w:t>
+      </w:r>
+      <w:proofErr w:type="spellStart"/>
+      <w:r>
+        <w:t>textit</w:t>
+      </w:r>
+      <w:proofErr w:type="spellEnd"/>
+      <w:r>
+        <w:t>{</w:t>
+      </w:r>
+      <w:proofErr w:type="spellStart"/>
+      <w:r>
+        <w:t>Dedicated</w:t>
+      </w:r>
+      <w:proofErr w:type="spellEnd"/>
+      <w:r>
+        <w:t xml:space="preserve"> Short-Range </w:t>
+      </w:r>
+      <w:proofErr w:type="spellStart"/>
+      <w:r>
+        <w:t>Communications</w:t>
+      </w:r>
+      <w:proofErr w:type="spellEnd"/>
+      <w:r>
+        <w:t>}) — Capítulo 1 (Sección Marco Teórico)</w:t>
+      </w:r>
+    </w:p>
+    <w:p>
+      <w:pPr>
+        <w:pStyle w:val="Texto"/>
+        <w:numPr>
+          <w:ilvl w:val="0"/>
+          <w:numId w:val="19"/>
+        </w:numPr>
+      </w:pPr>
+      <w:r>
+        <w:rPr>
+          <w:b/>
+          <w:bCs/>
+        </w:rPr>
+        <w:t>C-V2X</w:t>
+      </w:r>
+      <w:r>
+        <w:t> (\</w:t>
+      </w:r>
+      <w:proofErr w:type="spellStart"/>
+      <w:r>
+        <w:t>textit</w:t>
+      </w:r>
+      <w:proofErr w:type="spellEnd"/>
+      <w:r>
+        <w:t>{</w:t>
+      </w:r>
+      <w:proofErr w:type="spellStart"/>
+      <w:r>
+        <w:t>Cellular</w:t>
+      </w:r>
+      <w:proofErr w:type="spellEnd"/>
+      <w:r>
+        <w:t xml:space="preserve"> </w:t>
+      </w:r>
+      <w:proofErr w:type="spellStart"/>
+      <w:r>
+        <w:t>Vehicle-to-Everything</w:t>
+      </w:r>
+      <w:proofErr w:type="spellEnd"/>
+      <w:r>
+        <w:t>}) — Capítulo 1 (Sección Marco Teórico)</w:t>
+      </w:r>
+    </w:p>
+    <w:p>
+      <w:pPr>
+        <w:pStyle w:val="Texto"/>
+        <w:numPr>
+          <w:ilvl w:val="0"/>
+          <w:numId w:val="19"/>
+        </w:numPr>
+      </w:pPr>
+      <w:r>
+        <w:rPr>
+          <w:b/>
+          <w:bCs/>
+        </w:rPr>
+        <w:t>3GPP</w:t>
+      </w:r>
+      <w:r>
+        <w:t> (\</w:t>
+      </w:r>
+      <w:proofErr w:type="spellStart"/>
+      <w:r>
+        <w:t>textit</w:t>
+      </w:r>
+      <w:proofErr w:type="spellEnd"/>
+      <w:r>
+        <w:t xml:space="preserve">{Third </w:t>
+      </w:r>
+      <w:proofErr w:type="spellStart"/>
+      <w:r>
+        <w:t>Generation</w:t>
+      </w:r>
+      <w:proofErr w:type="spellEnd"/>
+      <w:r>
+        <w:t xml:space="preserve"> </w:t>
+      </w:r>
+      <w:proofErr w:type="spellStart"/>
+      <w:r>
+        <w:t>Partnership</w:t>
+      </w:r>
+      <w:proofErr w:type="spellEnd"/>
+      <w:r>
+        <w:t xml:space="preserve"> Project}) — Capítulo 1 (Sección Marco Teórico)</w:t>
+      </w:r>
+    </w:p>
+    <w:p>
+      <w:pPr>
+        <w:pStyle w:val="Texto"/>
+        <w:numPr>
+          <w:ilvl w:val="0"/>
+          <w:numId w:val="19"/>
+        </w:numPr>
+      </w:pPr>
+      <w:r>
+        <w:rPr>
+          <w:b/>
+          <w:bCs/>
+        </w:rPr>
+        <w:t>PHY</w:t>
+      </w:r>
+      <w:r>
+        <w:t> (\</w:t>
+      </w:r>
+      <w:proofErr w:type="spellStart"/>
+      <w:r>
+        <w:t>textit</w:t>
+      </w:r>
+      <w:proofErr w:type="spellEnd"/>
+      <w:r>
+        <w:t>{</w:t>
+      </w:r>
+      <w:proofErr w:type="spellStart"/>
+      <w:r>
+        <w:t>Physical</w:t>
+      </w:r>
+      <w:proofErr w:type="spellEnd"/>
+      <w:r>
+        <w:t xml:space="preserve"> Layer}) — Capítulo 1 (Sección Marco Teórico)</w:t>
+      </w:r>
+    </w:p>
+    <w:p>
+      <w:pPr>
+        <w:pStyle w:val="Texto"/>
+        <w:numPr>
+          <w:ilvl w:val="0"/>
+          <w:numId w:val="19"/>
+        </w:numPr>
+      </w:pPr>
+      <w:r>
+        <w:rPr>
+          <w:b/>
+          <w:bCs/>
+        </w:rPr>
+        <w:t>MAC</w:t>
+      </w:r>
+      <w:r>
+        <w:t> (\</w:t>
+      </w:r>
+      <w:proofErr w:type="spellStart"/>
+      <w:r>
+        <w:t>textit</w:t>
+      </w:r>
+      <w:proofErr w:type="spellEnd"/>
+      <w:r>
+        <w:t>{Medium Access Control}) — Capítulo 1 (Sección Marco Teórico)</w:t>
+      </w:r>
+    </w:p>
+    <w:p>
+      <w:pPr>
+        <w:pStyle w:val="Texto"/>
+        <w:numPr>
+          <w:ilvl w:val="0"/>
+          <w:numId w:val="19"/>
+        </w:numPr>
+      </w:pPr>
+      <w:r>
+        <w:rPr>
+          <w:b/>
+          <w:bCs/>
+        </w:rPr>
+        <w:t>V2V</w:t>
+      </w:r>
+      <w:r>
+        <w:t> (\</w:t>
+      </w:r>
+      <w:proofErr w:type="spellStart"/>
+      <w:r>
+        <w:t>textit</w:t>
+      </w:r>
+      <w:proofErr w:type="spellEnd"/>
+      <w:r>
+        <w:t>{</w:t>
+      </w:r>
+      <w:proofErr w:type="spellStart"/>
+      <w:r>
+        <w:t>Vehicle-to-Vehicle</w:t>
+      </w:r>
+      <w:proofErr w:type="spellEnd"/>
+      <w:r>
+        <w:t>}) — Capítulo 1 (Sección Marco Teórico)</w:t>
+      </w:r>
+    </w:p>
+    <w:p>
+      <w:pPr>
+        <w:pStyle w:val="Texto"/>
+        <w:numPr>
+          <w:ilvl w:val="0"/>
+          <w:numId w:val="19"/>
+        </w:numPr>
+      </w:pPr>
+      <w:r>
+        <w:rPr>
+          <w:b/>
+          <w:bCs/>
+        </w:rPr>
+        <w:t>V2P</w:t>
+      </w:r>
+      <w:r>
+        <w:t> (\</w:t>
+      </w:r>
+      <w:proofErr w:type="spellStart"/>
+      <w:r>
+        <w:t>textit</w:t>
+      </w:r>
+      <w:proofErr w:type="spellEnd"/>
+      <w:r>
+        <w:t>{</w:t>
+      </w:r>
+      <w:proofErr w:type="spellStart"/>
+      <w:r>
+        <w:t>Vehicle-to-Pedestrian</w:t>
+      </w:r>
+      <w:proofErr w:type="spellEnd"/>
+      <w:r>
+        <w:t>}) — Capítulo 1 (Sección Marco Teórico)</w:t>
+      </w:r>
+    </w:p>
+    <w:p>
+      <w:pPr>
+        <w:pStyle w:val="Texto"/>
+        <w:numPr>
+          <w:ilvl w:val="0"/>
+          <w:numId w:val="19"/>
+        </w:numPr>
+      </w:pPr>
+      <w:r>
+        <w:rPr>
+          <w:b/>
+          <w:bCs/>
+        </w:rPr>
+        <w:t>V2N</w:t>
+      </w:r>
+      <w:r>
+        <w:t> (\</w:t>
+      </w:r>
+      <w:proofErr w:type="spellStart"/>
+      <w:r>
+        <w:t>textit</w:t>
+      </w:r>
+      <w:proofErr w:type="spellEnd"/>
+      <w:r>
+        <w:t>{</w:t>
+      </w:r>
+      <w:proofErr w:type="spellStart"/>
+      <w:r>
+        <w:t>Vehicle</w:t>
+      </w:r>
+      <w:proofErr w:type="spellEnd"/>
+      <w:r>
+        <w:t>-</w:t>
+      </w:r>
+      <w:proofErr w:type="spellStart"/>
+      <w:r>
+        <w:t>to</w:t>
+      </w:r>
+      <w:proofErr w:type="spellEnd"/>
+      <w:r>
+        <w:t>-Network}) — Capítulo 1 (Sección Marco Teórico)</w:t>
+      </w:r>
+    </w:p>
+    <w:p>
+      <w:pPr>
+        <w:pStyle w:val="Texto"/>
+        <w:numPr>
+          <w:ilvl w:val="0"/>
+          <w:numId w:val="19"/>
+        </w:numPr>
+      </w:pPr>
+      <w:r>
+        <w:rPr>
+          <w:b/>
+          <w:bCs/>
+        </w:rPr>
+        <w:t>RSU</w:t>
+      </w:r>
+      <w:r>
+        <w:t> (\</w:t>
+      </w:r>
+      <w:proofErr w:type="spellStart"/>
+      <w:r>
+        <w:t>textit</w:t>
+      </w:r>
+      <w:proofErr w:type="spellEnd"/>
+      <w:r>
+        <w:t>{</w:t>
+      </w:r>
+      <w:proofErr w:type="spellStart"/>
+      <w:r>
+        <w:t>Roadside</w:t>
+      </w:r>
+      <w:proofErr w:type="spellEnd"/>
+      <w:r>
+        <w:t xml:space="preserve"> </w:t>
+      </w:r>
+      <w:proofErr w:type="spellStart"/>
+      <w:r>
+        <w:t>Unit</w:t>
+      </w:r>
+      <w:proofErr w:type="spellEnd"/>
+      <w:r>
+        <w:t>}) — Capítulo 1 (Sección Marco Teórico)</w:t>
+      </w:r>
+    </w:p>
+    <w:p>
+      <w:pPr>
+        <w:pStyle w:val="Texto"/>
+        <w:numPr>
+          <w:ilvl w:val="0"/>
+          <w:numId w:val="19"/>
+        </w:numPr>
+      </w:pPr>
+      <w:r>
+        <w:rPr>
+          <w:b/>
+          <w:bCs/>
+        </w:rPr>
+        <w:t>OLED</w:t>
+      </w:r>
+      <w:r>
+        <w:t> (\</w:t>
+      </w:r>
+      <w:proofErr w:type="spellStart"/>
+      <w:r>
+        <w:t>textit</w:t>
+      </w:r>
+      <w:proofErr w:type="spellEnd"/>
+      <w:r>
+        <w:t>{</w:t>
+      </w:r>
+      <w:proofErr w:type="spellStart"/>
+      <w:r>
+        <w:t>Organic</w:t>
+      </w:r>
+      <w:proofErr w:type="spellEnd"/>
+      <w:r>
+        <w:t xml:space="preserve"> Light </w:t>
+      </w:r>
+      <w:proofErr w:type="spellStart"/>
+      <w:r>
+        <w:t>Emitting</w:t>
+      </w:r>
+      <w:proofErr w:type="spellEnd"/>
+      <w:r>
+        <w:t xml:space="preserve"> </w:t>
+      </w:r>
+      <w:proofErr w:type="spellStart"/>
+      <w:r>
+        <w:t>Diode</w:t>
+      </w:r>
+      <w:proofErr w:type="spellEnd"/>
+      <w:r>
+        <w:t>}) — Capítulo 1 (Sección Marco Teórico)</w:t>
+      </w:r>
+    </w:p>
+    <w:p>
+      <w:pPr>
+        <w:pStyle w:val="Texto"/>
+        <w:numPr>
+          <w:ilvl w:val="0"/>
+          <w:numId w:val="19"/>
+        </w:numPr>
+      </w:pPr>
+      <w:r>
+        <w:rPr>
+          <w:b/>
+          <w:bCs/>
+        </w:rPr>
+        <w:t>IM/DD</w:t>
+      </w:r>
+      <w:r>
+        <w:t> (\</w:t>
+      </w:r>
+      <w:proofErr w:type="spellStart"/>
+      <w:r>
+        <w:t>textit</w:t>
+      </w:r>
+      <w:proofErr w:type="spellEnd"/>
+      <w:r>
+        <w:t>{</w:t>
+      </w:r>
+      <w:proofErr w:type="spellStart"/>
+      <w:r>
+        <w:t>Intensity</w:t>
+      </w:r>
+      <w:proofErr w:type="spellEnd"/>
+      <w:r>
+        <w:t xml:space="preserve"> </w:t>
+      </w:r>
+      <w:proofErr w:type="spellStart"/>
+      <w:r>
+        <w:t>Modulation</w:t>
+      </w:r>
+      <w:proofErr w:type="spellEnd"/>
+      <w:r>
+        <w:t xml:space="preserve"> / Direct </w:t>
+      </w:r>
+      <w:proofErr w:type="spellStart"/>
+      <w:r>
+        <w:t>Detection</w:t>
+      </w:r>
+      <w:proofErr w:type="spellEnd"/>
+      <w:r>
+        <w:t>}) — Capítulo 1 (Sección Marco Teórico)</w:t>
+      </w:r>
+    </w:p>
+    <w:p>
+      <w:pPr>
+        <w:pStyle w:val="Texto"/>
+        <w:numPr>
+          <w:ilvl w:val="0"/>
+          <w:numId w:val="19"/>
+        </w:numPr>
+      </w:pPr>
+      <w:r>
+        <w:rPr>
+          <w:b/>
+          <w:bCs/>
+        </w:rPr>
+        <w:t>FOV</w:t>
+      </w:r>
+      <w:r>
+        <w:t> (\</w:t>
+      </w:r>
+      <w:proofErr w:type="spellStart"/>
+      <w:r>
+        <w:t>textit</w:t>
+      </w:r>
+      <w:proofErr w:type="spellEnd"/>
+      <w:r>
+        <w:t xml:space="preserve">{Field </w:t>
+      </w:r>
+      <w:proofErr w:type="spellStart"/>
+      <w:r>
+        <w:t>of</w:t>
+      </w:r>
+      <w:proofErr w:type="spellEnd"/>
+      <w:r>
+        <w:t xml:space="preserve"> View}) — Capítulo 1 (Sección Marco Teórico)</w:t>
+      </w:r>
+    </w:p>
+    <w:p>
+      <w:pPr>
+        <w:pStyle w:val="Texto"/>
+        <w:numPr>
+          <w:ilvl w:val="0"/>
+          <w:numId w:val="19"/>
+        </w:numPr>
+      </w:pPr>
+      <w:r>
+        <w:rPr>
+          <w:b/>
+          <w:bCs/>
+        </w:rPr>
+        <w:t>IDFT</w:t>
+      </w:r>
+      <w:r>
+        <w:t> (\</w:t>
+      </w:r>
+      <w:proofErr w:type="spellStart"/>
+      <w:r>
+        <w:t>textit</w:t>
+      </w:r>
+      <w:proofErr w:type="spellEnd"/>
+      <w:r>
+        <w:t xml:space="preserve">{Inverse Discrete Fourier </w:t>
+      </w:r>
+      <w:proofErr w:type="spellStart"/>
+      <w:r>
+        <w:t>Transform</w:t>
+      </w:r>
+      <w:proofErr w:type="spellEnd"/>
+      <w:r>
+        <w:t>}) — Capítulo 1 (Sección Marco Teórico)</w:t>
+      </w:r>
+    </w:p>
+    <w:p>
+      <w:pPr>
+        <w:pStyle w:val="Texto"/>
+        <w:numPr>
+          <w:ilvl w:val="0"/>
+          <w:numId w:val="19"/>
+        </w:numPr>
+      </w:pPr>
+      <w:r>
+        <w:rPr>
+          <w:b/>
+          <w:bCs/>
+        </w:rPr>
+        <w:t>GI</w:t>
+      </w:r>
+      <w:r>
+        <w:t> (\</w:t>
+      </w:r>
+      <w:proofErr w:type="spellStart"/>
+      <w:r>
+        <w:t>textit</w:t>
+      </w:r>
+      <w:proofErr w:type="spellEnd"/>
+      <w:r>
+        <w:t>{Guard Interval}) — Capítulo 1 (Sección Marco Teórico)</w:t>
+      </w:r>
+    </w:p>
+    <w:p>
+      <w:pPr>
+        <w:pStyle w:val="Texto"/>
+        <w:numPr>
+          <w:ilvl w:val="0"/>
+          <w:numId w:val="19"/>
+        </w:numPr>
+      </w:pPr>
+      <w:r>
+        <w:rPr>
+          <w:b/>
+          <w:bCs/>
+        </w:rPr>
+        <w:t>ISI</w:t>
+      </w:r>
+      <w:r>
+        <w:t> (\</w:t>
+      </w:r>
+      <w:proofErr w:type="spellStart"/>
+      <w:r>
+        <w:t>textit</w:t>
+      </w:r>
+      <w:proofErr w:type="spellEnd"/>
+      <w:r>
+        <w:t xml:space="preserve">{Inter-Symbol </w:t>
+      </w:r>
+      <w:proofErr w:type="spellStart"/>
+      <w:r>
+        <w:t>Interference</w:t>
+      </w:r>
+      <w:proofErr w:type="spellEnd"/>
+      <w:r>
+        <w:t>}) — Capítulo 1 (Sección Marco Teórico)</w:t>
+      </w:r>
+    </w:p>
+    <w:p>
+      <w:pPr>
+        <w:pStyle w:val="Texto"/>
+        <w:numPr>
+          <w:ilvl w:val="0"/>
+          <w:numId w:val="19"/>
+        </w:numPr>
+      </w:pPr>
+      <w:r>
+        <w:rPr>
+          <w:b/>
+          <w:bCs/>
+        </w:rPr>
+        <w:t>CP</w:t>
+      </w:r>
+      <w:r>
+        <w:t> (\</w:t>
+      </w:r>
+      <w:proofErr w:type="spellStart"/>
+      <w:r>
+        <w:t>textit</w:t>
+      </w:r>
+      <w:proofErr w:type="spellEnd"/>
+      <w:r>
+        <w:t>{</w:t>
+      </w:r>
+      <w:proofErr w:type="spellStart"/>
+      <w:r>
+        <w:t>Cyclic</w:t>
+      </w:r>
+      <w:proofErr w:type="spellEnd"/>
+      <w:r>
+        <w:t xml:space="preserve"> </w:t>
+      </w:r>
+      <w:proofErr w:type="spellStart"/>
+      <w:r>
+        <w:t>Prefix</w:t>
+      </w:r>
+      <w:proofErr w:type="spellEnd"/>
+      <w:r>
+        <w:t>}) — Capítulo 1 (Sección Marco Teórico)</w:t>
+      </w:r>
+    </w:p>
+    <w:p>
+      <w:pPr>
+        <w:pStyle w:val="Texto"/>
+        <w:numPr>
+          <w:ilvl w:val="0"/>
+          <w:numId w:val="19"/>
+        </w:numPr>
+      </w:pPr>
+      <w:r>
+        <w:rPr>
+          <w:b/>
+          <w:bCs/>
+        </w:rPr>
+        <w:t>QPSK</w:t>
+      </w:r>
+      <w:r>
+        <w:t> (\</w:t>
+      </w:r>
+      <w:proofErr w:type="spellStart"/>
+      <w:r>
+        <w:t>textit</w:t>
+      </w:r>
+      <w:proofErr w:type="spellEnd"/>
+      <w:r>
+        <w:t>{</w:t>
+      </w:r>
+      <w:proofErr w:type="spellStart"/>
+      <w:r>
+        <w:t>Quadrature</w:t>
+      </w:r>
+      <w:proofErr w:type="spellEnd"/>
+      <w:r>
+        <w:t xml:space="preserve"> </w:t>
+      </w:r>
+      <w:proofErr w:type="spellStart"/>
+      <w:r>
+        <w:t>Phase</w:t>
+      </w:r>
+      <w:proofErr w:type="spellEnd"/>
+      <w:r>
+        <w:t xml:space="preserve"> Shift </w:t>
+      </w:r>
+      <w:proofErr w:type="spellStart"/>
+      <w:r>
+        <w:t>Keying</w:t>
+      </w:r>
+      <w:proofErr w:type="spellEnd"/>
+      <w:r>
+        <w:t>}) — Capítulo 2 (Sección Marco Teórico)</w:t>
+      </w:r>
+    </w:p>
+    <w:p>
+      <w:pPr>
+        <w:pStyle w:val="Texto"/>
+        <w:numPr>
+          <w:ilvl w:val="0"/>
+          <w:numId w:val="19"/>
+        </w:numPr>
+      </w:pPr>
+      <w:r>
+        <w:rPr>
+          <w:b/>
+          <w:bCs/>
+        </w:rPr>
+        <w:t>FDE</w:t>
+      </w:r>
+      <w:r>
+        <w:t> (\</w:t>
+      </w:r>
+      <w:proofErr w:type="spellStart"/>
+      <w:r>
+        <w:t>textit</w:t>
+      </w:r>
+      <w:proofErr w:type="spellEnd"/>
+      <w:r>
+        <w:t>{</w:t>
+      </w:r>
+      <w:proofErr w:type="spellStart"/>
+      <w:r>
+        <w:t>Frequency</w:t>
+      </w:r>
+      <w:proofErr w:type="spellEnd"/>
+      <w:r>
+        <w:t xml:space="preserve"> Domain </w:t>
+      </w:r>
+      <w:proofErr w:type="spellStart"/>
+      <w:r>
+        <w:t>Equalization</w:t>
+      </w:r>
+      <w:proofErr w:type="spellEnd"/>
+      <w:r>
+        <w:t>}) — Capítulo 2 (Sección Ecualización)</w:t>
+      </w:r>
+    </w:p>
+    <w:p>
+      <w:pPr>
+        <w:pStyle w:val="Texto"/>
+        <w:numPr>
+          <w:ilvl w:val="0"/>
+          <w:numId w:val="19"/>
+        </w:numPr>
+      </w:pPr>
+      <w:r>
+        <w:rPr>
+          <w:b/>
+          <w:bCs/>
+        </w:rPr>
+        <w:lastRenderedPageBreak/>
+        <w:t>OFDMA</w:t>
+      </w:r>
+      <w:r>
+        <w:t> (\</w:t>
+      </w:r>
+      <w:proofErr w:type="spellStart"/>
+      <w:r>
+        <w:t>textit</w:t>
+      </w:r>
+      <w:proofErr w:type="spellEnd"/>
+      <w:r>
+        <w:t>{</w:t>
+      </w:r>
+      <w:proofErr w:type="spellStart"/>
+      <w:r>
+        <w:t>Orthogonal</w:t>
+      </w:r>
+      <w:proofErr w:type="spellEnd"/>
+      <w:r>
+        <w:t xml:space="preserve"> </w:t>
+      </w:r>
+      <w:proofErr w:type="spellStart"/>
+      <w:r>
+        <w:t>Frequency</w:t>
+      </w:r>
+      <w:proofErr w:type="spellEnd"/>
+      <w:r>
+        <w:t xml:space="preserve"> </w:t>
+      </w:r>
+      <w:proofErr w:type="spellStart"/>
+      <w:r>
+        <w:t>Division</w:t>
+      </w:r>
+      <w:proofErr w:type="spellEnd"/>
+      <w:r>
+        <w:t xml:space="preserve"> </w:t>
+      </w:r>
+      <w:proofErr w:type="spellStart"/>
+      <w:r>
+        <w:t>Multiple</w:t>
+      </w:r>
+      <w:proofErr w:type="spellEnd"/>
+      <w:r>
+        <w:t xml:space="preserve"> Access}) — Capítulo 3 (Sección Recomendaciones)</w:t>
+      </w:r>
+    </w:p>
+    <w:p>
+      <w:pPr>
+        <w:pStyle w:val="Texto"/>
+        <w:numPr>
+          <w:ilvl w:val="0"/>
+          <w:numId w:val="19"/>
+        </w:numPr>
+      </w:pPr>
+      <w:r>
+        <w:rPr>
+          <w:b/>
+          <w:bCs/>
+        </w:rPr>
+        <w:t>SDMA</w:t>
+      </w:r>
+      <w:r>
+        <w:t> (\</w:t>
+      </w:r>
+      <w:proofErr w:type="spellStart"/>
+      <w:r>
+        <w:t>textit</w:t>
+      </w:r>
+      <w:proofErr w:type="spellEnd"/>
+      <w:r>
+        <w:t xml:space="preserve">{Space </w:t>
+      </w:r>
+      <w:proofErr w:type="spellStart"/>
+      <w:r>
+        <w:t>Division</w:t>
+      </w:r>
+      <w:proofErr w:type="spellEnd"/>
+      <w:r>
+        <w:t xml:space="preserve"> </w:t>
+      </w:r>
+      <w:proofErr w:type="spellStart"/>
+      <w:r>
+        <w:t>Multiple</w:t>
+      </w:r>
+      <w:proofErr w:type="spellEnd"/>
+      <w:r>
+        <w:t xml:space="preserve"> Access}) — Capítulo 3 (Sección Recomendaciones)</w:t>
+      </w:r>
+    </w:p>
+    <w:p>
+      <w:pPr>
+        <w:pStyle w:val="Texto"/>
+        <w:numPr>
+          <w:ilvl w:val="0"/>
+          <w:numId w:val="19"/>
+        </w:numPr>
+      </w:pPr>
+      <w:r>
+        <w:rPr>
+          <w:b/>
+          <w:bCs/>
+        </w:rPr>
+        <w:t>SDR</w:t>
+      </w:r>
+      <w:r>
+        <w:t> (\</w:t>
+      </w:r>
+      <w:proofErr w:type="spellStart"/>
+      <w:r>
+        <w:t>textit</w:t>
+      </w:r>
+      <w:proofErr w:type="spellEnd"/>
+      <w:r>
+        <w:t xml:space="preserve">{Software </w:t>
+      </w:r>
+      <w:proofErr w:type="spellStart"/>
+      <w:r>
+        <w:t>Defined</w:t>
+      </w:r>
+      <w:proofErr w:type="spellEnd"/>
+      <w:r>
+        <w:t xml:space="preserve"> Radio}) — Capítulo 3 (Sección Recomendaciones)</w:t>
+      </w:r>
+    </w:p>
+    <w:p>
+      <w:pPr>
+        <w:pStyle w:val="Texto"/>
+        <w:numPr>
+          <w:ilvl w:val="0"/>
+          <w:numId w:val="19"/>
+        </w:numPr>
+      </w:pPr>
+      <w:r>
+        <w:rPr>
+          <w:b/>
+          <w:bCs/>
+        </w:rPr>
+        <w:t>HIL</w:t>
+      </w:r>
+      <w:r>
+        <w:t> (\</w:t>
+      </w:r>
+      <w:proofErr w:type="spellStart"/>
+      <w:r>
+        <w:t>textit</w:t>
+      </w:r>
+      <w:proofErr w:type="spellEnd"/>
+      <w:r>
+        <w:t>{Hardware-in-</w:t>
+      </w:r>
+      <w:proofErr w:type="spellStart"/>
+      <w:r>
+        <w:t>the</w:t>
+      </w:r>
+      <w:proofErr w:type="spellEnd"/>
+      <w:r>
+        <w:t>-Loop}) — Capítulo 3 (Sección Recomendaciones)</w:t>
+      </w:r>
+    </w:p>
+    <w:p>
+      <w:pPr>
+        <w:pStyle w:val="Texto"/>
+      </w:pPr>
+    </w:p>
     <w:sectPr>
       <w:footerReference w:type="default" r:id="rId12"/>
       <w:pgSz w:w="11906" w:h="16838" w:code="9"/>
@@ -21495,6 +23479,119 @@
     </w:lvl>
   </w:abstractNum>
   <w:abstractNum w:abstractNumId="16" w15:restartNumberingAfterBreak="0">
+    <w:nsid w:val="7C0815A9"/>
+    <w:multiLevelType w:val="multilevel"/>
+    <w:tmpl w:val="57BE9E3E"/>
+    <w:lvl w:ilvl="0">
+      <w:start w:val="1"/>
+      <w:numFmt w:val="decimal"/>
+      <w:lvlText w:val="%1."/>
+      <w:lvlJc w:val="left"/>
+      <w:pPr>
+        <w:tabs>
+          <w:tab w:val="num" w:pos="720"/>
+        </w:tabs>
+        <w:ind w:left="720" w:hanging="360"/>
+      </w:pPr>
+    </w:lvl>
+    <w:lvl w:ilvl="1" w:tentative="1">
+      <w:start w:val="1"/>
+      <w:numFmt w:val="decimal"/>
+      <w:lvlText w:val="%2."/>
+      <w:lvlJc w:val="left"/>
+      <w:pPr>
+        <w:tabs>
+          <w:tab w:val="num" w:pos="1440"/>
+        </w:tabs>
+        <w:ind w:left="1440" w:hanging="360"/>
+      </w:pPr>
+    </w:lvl>
+    <w:lvl w:ilvl="2" w:tentative="1">
+      <w:start w:val="1"/>
+      <w:numFmt w:val="decimal"/>
+      <w:lvlText w:val="%3."/>
+      <w:lvlJc w:val="left"/>
+      <w:pPr>
+        <w:tabs>
+          <w:tab w:val="num" w:pos="2160"/>
+        </w:tabs>
+        <w:ind w:left="2160" w:hanging="360"/>
+      </w:pPr>
+    </w:lvl>
+    <w:lvl w:ilvl="3" w:tentative="1">
+      <w:start w:val="1"/>
+      <w:numFmt w:val="decimal"/>
+      <w:lvlText w:val="%4."/>
+      <w:lvlJc w:val="left"/>
+      <w:pPr>
+        <w:tabs>
+          <w:tab w:val="num" w:pos="2880"/>
+        </w:tabs>
+        <w:ind w:left="2880" w:hanging="360"/>
+      </w:pPr>
+    </w:lvl>
+    <w:lvl w:ilvl="4" w:tentative="1">
+      <w:start w:val="1"/>
+      <w:numFmt w:val="decimal"/>
+      <w:lvlText w:val="%5."/>
+      <w:lvlJc w:val="left"/>
+      <w:pPr>
+        <w:tabs>
+          <w:tab w:val="num" w:pos="3600"/>
+        </w:tabs>
+        <w:ind w:left="3600" w:hanging="360"/>
+      </w:pPr>
+    </w:lvl>
+    <w:lvl w:ilvl="5" w:tentative="1">
+      <w:start w:val="1"/>
+      <w:numFmt w:val="decimal"/>
+      <w:lvlText w:val="%6."/>
+      <w:lvlJc w:val="left"/>
+      <w:pPr>
+        <w:tabs>
+          <w:tab w:val="num" w:pos="4320"/>
+        </w:tabs>
+        <w:ind w:left="4320" w:hanging="360"/>
+      </w:pPr>
+    </w:lvl>
+    <w:lvl w:ilvl="6" w:tentative="1">
+      <w:start w:val="1"/>
+      <w:numFmt w:val="decimal"/>
+      <w:lvlText w:val="%7."/>
+      <w:lvlJc w:val="left"/>
+      <w:pPr>
+        <w:tabs>
+          <w:tab w:val="num" w:pos="5040"/>
+        </w:tabs>
+        <w:ind w:left="5040" w:hanging="360"/>
+      </w:pPr>
+    </w:lvl>
+    <w:lvl w:ilvl="7" w:tentative="1">
+      <w:start w:val="1"/>
+      <w:numFmt w:val="decimal"/>
+      <w:lvlText w:val="%8."/>
+      <w:lvlJc w:val="left"/>
+      <w:pPr>
+        <w:tabs>
+          <w:tab w:val="num" w:pos="5760"/>
+        </w:tabs>
+        <w:ind w:left="5760" w:hanging="360"/>
+      </w:pPr>
+    </w:lvl>
+    <w:lvl w:ilvl="8" w:tentative="1">
+      <w:start w:val="1"/>
+      <w:numFmt w:val="decimal"/>
+      <w:lvlText w:val="%9."/>
+      <w:lvlJc w:val="left"/>
+      <w:pPr>
+        <w:tabs>
+          <w:tab w:val="num" w:pos="6480"/>
+        </w:tabs>
+        <w:ind w:left="6480" w:hanging="360"/>
+      </w:pPr>
+    </w:lvl>
+  </w:abstractNum>
+  <w:abstractNum w:abstractNumId="17" w15:restartNumberingAfterBreak="0">
     <w:nsid w:val="7E317FEB"/>
     <w:multiLevelType w:val="multilevel"/>
     <w:tmpl w:val="61B23EF8"/>
@@ -21643,7 +23740,7 @@
       </w:rPr>
     </w:lvl>
   </w:abstractNum>
-  <w:abstractNum w:abstractNumId="17" w15:restartNumberingAfterBreak="0">
+  <w:abstractNum w:abstractNumId="18" w15:restartNumberingAfterBreak="0">
     <w:nsid w:val="7E960B2E"/>
     <w:multiLevelType w:val="multilevel"/>
     <w:tmpl w:val="2AD24356"/>
@@ -21817,7 +23914,7 @@
     <w:abstractNumId w:val="8"/>
   </w:num>
   <w:num w:numId="9" w16cid:durableId="1538351155">
-    <w:abstractNumId w:val="17"/>
+    <w:abstractNumId w:val="18"/>
   </w:num>
   <w:num w:numId="10" w16cid:durableId="698507891">
     <w:abstractNumId w:val="10"/>
@@ -21829,7 +23926,7 @@
     <w:abstractNumId w:val="7"/>
   </w:num>
   <w:num w:numId="13" w16cid:durableId="5182466">
-    <w:abstractNumId w:val="16"/>
+    <w:abstractNumId w:val="17"/>
   </w:num>
   <w:num w:numId="14" w16cid:durableId="1308852163">
     <w:abstractNumId w:val="9"/>
@@ -21845,6 +23942,9 @@
   </w:num>
   <w:num w:numId="18" w16cid:durableId="1252353452">
     <w:abstractNumId w:val="0"/>
+  </w:num>
+  <w:num w:numId="19" w16cid:durableId="207182247">
+    <w:abstractNumId w:val="16"/>
   </w:num>
   <w:numIdMacAtCleanup w:val="18"/>
 </w:numbering>
@@ -22490,7 +24590,6 @@
   <w:style w:type="character" w:default="1" w:styleId="Fuentedeprrafopredeter">
     <w:name w:val="Default Paragraph Font"/>
     <w:uiPriority w:val="1"/>
-    <w:semiHidden/>
     <w:unhideWhenUsed/>
   </w:style>
   <w:style w:type="table" w:default="1" w:styleId="Tablanormal">

</xml_diff>